<commit_message>
docs: video + voice-over script updated — shared sign-in accounts (ZFYBLS / XFLS) replace first-run account creation
</commit_message>
<xml_diff>
--- a/media/manual/SPR-Video-Voiceover-Script.docx
+++ b/media/manual/SPR-Video-Voiceover-Script.docx
@@ -237,7 +237,7 @@
                 <w:color w:val="0B8ED2"/>
                 <w:sz w:val="28"/>
               </w:rPr>
-              <w:t>TAKE 03  -  First-time setup</w:t>
+              <w:t>TAKE 03  -  Signing in with your shared account</w:t>
             </w:r>
           </w:p>
           <w:p>
@@ -247,7 +247,7 @@
                 <w:color w:val="666666"/>
                 <w:sz w:val="21"/>
               </w:rPr>
-              <w:t>On screen: 0:43 - 1:28     -     Target: ~82 words</w:t>
+              <w:t>On screen: 0:43 - 1:27     -     Target: ~66 words</w:t>
             </w:r>
           </w:p>
           <w:p>
@@ -258,7 +258,7 @@
               <w:rPr>
                 <w:sz w:val="30"/>
               </w:rPr>
-              <w:t>"Now, set up this browser. Choose a username you'll remember - I'll use, teacher dot mo. Then a password with at least eight characters, and type it once more to confirm. Please write your password on paper and keep it safe - nobody can recover it for you. Click, Create sign-in. And that's it! Now choose how to start: create a new class, import an Excel file, or load the sample class to explore. Let's load the sample."</w:t>
+              <w:t>"Signing in is simple. Two accounts are ready on this computer - ZFYBLS, and XFLS. Type your username - I'll use ZFYBLS - and the password shared with you. Click, Sign In. Now choose how to start: create a new class, import an Excel file, or load the sample class to explore. Let's load the sample."</w:t>
             </w:r>
           </w:p>
           <w:p>
@@ -268,7 +268,7 @@
                 <w:color w:val="8A5A00"/>
                 <w:sz w:val="21"/>
               </w:rPr>
-              <w:t>Note: The typing happens on screen - no need to read every keystroke.</w:t>
+              <w:t>Note: The password shows as dots on screen - no need to hide anything.</w:t>
             </w:r>
           </w:p>
         </w:tc>
@@ -310,7 +310,7 @@
                 <w:color w:val="666666"/>
                 <w:sz w:val="21"/>
               </w:rPr>
-              <w:t>On screen: 1:28 - 1:45     -     Target: ~24 words</w:t>
+              <w:t>On screen: 1:27 - 1:45     -     Target: ~24 words</w:t>
             </w:r>
           </w:p>
           <w:p>
@@ -363,7 +363,7 @@
                 <w:color w:val="666666"/>
                 <w:sz w:val="21"/>
               </w:rPr>
-              <w:t>On screen: 1:45 - 2:10     -     Target: ~48 words</w:t>
+              <w:t>On screen: 1:45 - 2:08     -     Target: ~48 words</w:t>
             </w:r>
           </w:p>
           <w:p>
@@ -416,7 +416,7 @@
                 <w:color w:val="666666"/>
                 <w:sz w:val="21"/>
               </w:rPr>
-              <w:t>On screen: 2:08 - 2:28     -     Target: ~35 words</w:t>
+              <w:t>On screen: 2:08 - 2:26     -     Target: ~35 words</w:t>
             </w:r>
           </w:p>
           <w:p>
@@ -469,7 +469,7 @@
                 <w:color w:val="666666"/>
                 <w:sz w:val="21"/>
               </w:rPr>
-              <w:t>On screen: 2:26 - 2:58     -     Target: ~56 words</w:t>
+              <w:t>On screen: 2:26 - 2:56     -     Target: ~56 words</w:t>
             </w:r>
           </w:p>
           <w:p>
@@ -532,7 +532,7 @@
                 <w:color w:val="666666"/>
                 <w:sz w:val="21"/>
               </w:rPr>
-              <w:t>On screen: 2:58 - 3:15     -     Target: ~35 words</w:t>
+              <w:t>On screen: 2:56 - 3:11     -     Target: ~35 words</w:t>
             </w:r>
           </w:p>
           <w:p>
@@ -585,7 +585,7 @@
                 <w:color w:val="666666"/>
                 <w:sz w:val="21"/>
               </w:rPr>
-              <w:t>On screen: 3:13 - 3:35     -     Target: ~36 words</w:t>
+              <w:t>On screen: 3:11 - 3:31     -     Target: ~36 words</w:t>
             </w:r>
           </w:p>
           <w:p>
@@ -638,7 +638,7 @@
                 <w:color w:val="666666"/>
                 <w:sz w:val="21"/>
               </w:rPr>
-              <w:t>On screen: 3:35 - 3:58     -     Target: ~37 words</w:t>
+              <w:t>On screen: 3:31 - 3:52     -     Target: ~37 words</w:t>
             </w:r>
           </w:p>
           <w:p>
@@ -691,7 +691,7 @@
                 <w:color w:val="666666"/>
                 <w:sz w:val="21"/>
               </w:rPr>
-              <w:t>On screen: 3:56 - 4:14     -     Target: ~38 words</w:t>
+              <w:t>On screen: 3:52 - 4:12     -     Target: ~38 words</w:t>
             </w:r>
           </w:p>
           <w:p>
@@ -744,7 +744,7 @@
                 <w:color w:val="666666"/>
                 <w:sz w:val="21"/>
               </w:rPr>
-              <w:t>On screen: 4:14 - 4:26     -     Target: ~26 words</w:t>
+              <w:t>On screen: 4:12 - 4:23     -     Target: ~26 words</w:t>
             </w:r>
           </w:p>
           <w:p>

</xml_diff>